<commit_message>
Remove re-engagement-solicitation regex check; add manual-flagged/astrotalk-clean export
Co-Authored-By: Claude Opus 4.8 <noreply@anthropic.com>
</commit_message>
<xml_diff>
--- a/llm_call/session_report.docx
+++ b/llm_call/session_report.docx
@@ -48,7 +48,7 @@
         <w:pStyle w:val="Heading1"/>
       </w:pPr>
       <w:r>
-        <w:t>Summary — manual vs LLM (submitted / locked)</w:t>
+        <w:t>Summary — manual vs LLM by verdict</w:t>
       </w:r>
     </w:p>
     <w:tbl>
@@ -58,61 +58,27 @@
         <w:tblLook w:firstColumn="1" w:firstRow="1" w:lastColumn="0" w:lastRow="0" w:noHBand="0" w:noVBand="1" w:val="04A0"/>
       </w:tblPr>
       <w:tblGrid>
-        <w:gridCol w:w="2160"/>
-        <w:gridCol w:w="2160"/>
-        <w:gridCol w:w="2160"/>
-        <w:gridCol w:w="2160"/>
+        <w:gridCol w:w="4320"/>
+        <w:gridCol w:w="4320"/>
       </w:tblGrid>
       <w:tr>
         <w:tc>
           <w:tcPr>
-            <w:tcW w:type="dxa" w:w="2160"/>
+            <w:tcW w:type="dxa" w:w="4320"/>
           </w:tcPr>
           <w:p>
             <w:r>
-              <w:rPr>
-                <w:b/>
-              </w:rPr>
-              <w:t>CATEGORY</w:t>
+              <w:t>Manual review (data_loader)</w:t>
             </w:r>
           </w:p>
         </w:tc>
         <w:tc>
           <w:tcPr>
-            <w:tcW w:type="dxa" w:w="2160"/>
+            <w:tcW w:type="dxa" w:w="4320"/>
           </w:tcPr>
           <w:p>
             <w:r>
-              <w:rPr>
-                <w:b/>
-              </w:rPr>
-              <w:t>SUBMITTED_FOR_REVIEW</w:t>
-            </w:r>
-          </w:p>
-        </w:tc>
-        <w:tc>
-          <w:tcPr>
-            <w:tcW w:type="dxa" w:w="2160"/>
-          </w:tcPr>
-          <w:p>
-            <w:r>
-              <w:rPr>
-                <w:b/>
-              </w:rPr>
-              <w:t>LOCKED</w:t>
-            </w:r>
-          </w:p>
-        </w:tc>
-        <w:tc>
-          <w:tcPr>
-            <w:tcW w:type="dxa" w:w="2160"/>
-          </w:tcPr>
-          <w:p>
-            <w:r>
-              <w:rPr>
-                <w:b/>
-              </w:rPr>
-              <w:t>TOTAL</w:t>
+              <w:t>4</w:t>
             </w:r>
           </w:p>
         </w:tc>
@@ -120,37 +86,17 @@
       <w:tr>
         <w:tc>
           <w:tcPr>
-            <w:tcW w:type="dxa" w:w="2160"/>
+            <w:tcW w:type="dxa" w:w="4320"/>
           </w:tcPr>
           <w:p>
             <w:r>
-              <w:t>Manually reviewed</w:t>
+              <w:t xml:space="preserve">    CLEAN</w:t>
             </w:r>
           </w:p>
         </w:tc>
         <w:tc>
           <w:tcPr>
-            <w:tcW w:type="dxa" w:w="2160"/>
-          </w:tcPr>
-          <w:p>
-            <w:r>
-              <w:t>1</w:t>
-            </w:r>
-          </w:p>
-        </w:tc>
-        <w:tc>
-          <w:tcPr>
-            <w:tcW w:type="dxa" w:w="2160"/>
-          </w:tcPr>
-          <w:p>
-            <w:r>
-              <w:t>2</w:t>
-            </w:r>
-          </w:p>
-        </w:tc>
-        <w:tc>
-          <w:tcPr>
-            <w:tcW w:type="dxa" w:w="2160"/>
+            <w:tcW w:type="dxa" w:w="4320"/>
           </w:tcPr>
           <w:p>
             <w:r>
@@ -162,17 +108,39 @@
       <w:tr>
         <w:tc>
           <w:tcPr>
-            <w:tcW w:type="dxa" w:w="2160"/>
+            <w:tcW w:type="dxa" w:w="4320"/>
           </w:tcPr>
           <w:p>
             <w:r>
-              <w:t>LLM-processed</w:t>
+              <w:t xml:space="preserve">    FLAGGED</w:t>
             </w:r>
           </w:p>
         </w:tc>
         <w:tc>
           <w:tcPr>
-            <w:tcW w:type="dxa" w:w="2160"/>
+            <w:tcW w:type="dxa" w:w="4320"/>
+          </w:tcPr>
+          <w:p>
+            <w:r>
+              <w:t>0</w:t>
+            </w:r>
+          </w:p>
+        </w:tc>
+      </w:tr>
+      <w:tr>
+        <w:tc>
+          <w:tcPr>
+            <w:tcW w:type="dxa" w:w="4320"/>
+          </w:tcPr>
+          <w:p>
+            <w:r>
+              <w:t xml:space="preserve">    SEVERE</w:t>
+            </w:r>
+          </w:p>
+        </w:tc>
+        <w:tc>
+          <w:tcPr>
+            <w:tcW w:type="dxa" w:w="4320"/>
           </w:tcPr>
           <w:p>
             <w:r>
@@ -180,19 +148,109 @@
             </w:r>
           </w:p>
         </w:tc>
+      </w:tr>
+      <w:tr>
         <w:tc>
           <w:tcPr>
-            <w:tcW w:type="dxa" w:w="2160"/>
+            <w:tcW w:type="dxa" w:w="4320"/>
           </w:tcPr>
           <w:p>
             <w:r>
-              <w:t>3</w:t>
+              <w:t>LLM review (LLM flag or reviewer_id=LLM)</w:t>
             </w:r>
           </w:p>
         </w:tc>
         <w:tc>
           <w:tcPr>
-            <w:tcW w:type="dxa" w:w="2160"/>
+            <w:tcW w:type="dxa" w:w="4320"/>
+          </w:tcPr>
+          <w:p>
+            <w:r>
+              <w:t>0</w:t>
+            </w:r>
+          </w:p>
+        </w:tc>
+      </w:tr>
+      <w:tr>
+        <w:tc>
+          <w:tcPr>
+            <w:tcW w:type="dxa" w:w="4320"/>
+          </w:tcPr>
+          <w:p>
+            <w:r>
+              <w:t xml:space="preserve">    CLEAN</w:t>
+            </w:r>
+          </w:p>
+        </w:tc>
+        <w:tc>
+          <w:tcPr>
+            <w:tcW w:type="dxa" w:w="4320"/>
+          </w:tcPr>
+          <w:p>
+            <w:r>
+              <w:t>0</w:t>
+            </w:r>
+          </w:p>
+        </w:tc>
+      </w:tr>
+      <w:tr>
+        <w:tc>
+          <w:tcPr>
+            <w:tcW w:type="dxa" w:w="4320"/>
+          </w:tcPr>
+          <w:p>
+            <w:r>
+              <w:t xml:space="preserve">    FLAGGED</w:t>
+            </w:r>
+          </w:p>
+        </w:tc>
+        <w:tc>
+          <w:tcPr>
+            <w:tcW w:type="dxa" w:w="4320"/>
+          </w:tcPr>
+          <w:p>
+            <w:r>
+              <w:t>0</w:t>
+            </w:r>
+          </w:p>
+        </w:tc>
+      </w:tr>
+      <w:tr>
+        <w:tc>
+          <w:tcPr>
+            <w:tcW w:type="dxa" w:w="4320"/>
+          </w:tcPr>
+          <w:p>
+            <w:r>
+              <w:t xml:space="preserve">    SEVERE</w:t>
+            </w:r>
+          </w:p>
+        </w:tc>
+        <w:tc>
+          <w:tcPr>
+            <w:tcW w:type="dxa" w:w="4320"/>
+          </w:tcPr>
+          <w:p>
+            <w:r>
+              <w:t>0</w:t>
+            </w:r>
+          </w:p>
+        </w:tc>
+      </w:tr>
+      <w:tr>
+        <w:tc>
+          <w:tcPr>
+            <w:tcW w:type="dxa" w:w="4320"/>
+          </w:tcPr>
+          <w:p>
+            <w:r>
+              <w:t>ALL sessions</w:t>
+            </w:r>
+          </w:p>
+        </w:tc>
+        <w:tc>
+          <w:tcPr>
+            <w:tcW w:type="dxa" w:w="4320"/>
           </w:tcPr>
           <w:p>
             <w:r>
@@ -207,7 +265,7 @@
         <w:rPr>
           <w:i/>
         </w:rPr>
-        <w:t>Manually reviewed = reviewer_id set; LLM-processed = verdict not UNPROCESSED. They overlap.</w:t>
+        <w:t>LLM review = has LLM-source flag OR reviewer_id 'LLM' (ingest_llm); Manual review = all others (data_loader). Mutually exclusive; sum to ALL.</w:t>
       </w:r>
     </w:p>
     <w:p>
@@ -267,7 +325,7 @@
           </w:tcPr>
           <w:p>
             <w:r>
-              <w:t>4</w:t>
+              <w:t>3</w:t>
             </w:r>
           </w:p>
         </w:tc>
@@ -298,7 +356,7 @@
           </w:tcPr>
           <w:p>
             <w:r>
-              <w:t>Manually submitted (ever)</w:t>
+              <w:t>Manually submitted (L1, ever)</w:t>
             </w:r>
           </w:p>
         </w:tc>
@@ -320,7 +378,29 @@
           </w:tcPr>
           <w:p>
             <w:r>
-              <w:t>Currently submitted</w:t>
+              <w:t>LLM auto-submitted (ever)</w:t>
+            </w:r>
+          </w:p>
+        </w:tc>
+        <w:tc>
+          <w:tcPr>
+            <w:tcW w:type="dxa" w:w="4320"/>
+          </w:tcPr>
+          <w:p>
+            <w:r>
+              <w:t>0</w:t>
+            </w:r>
+          </w:p>
+        </w:tc>
+      </w:tr>
+      <w:tr>
+        <w:tc>
+          <w:tcPr>
+            <w:tcW w:type="dxa" w:w="4320"/>
+          </w:tcPr>
+          <w:p>
+            <w:r>
+              <w:t>Currently SUBMITTED_FOR_REVIEW</w:t>
             </w:r>
           </w:p>
         </w:tc>
@@ -709,7 +789,7 @@
         <w:pStyle w:val="Heading1"/>
       </w:pPr>
       <w:r>
-        <w:t>AstroTalk accuracy (vs reviewed verdict)</w:t>
+        <w:t>AstroTalk false positives / negatives</w:t>
       </w:r>
     </w:p>
     <w:tbl>
@@ -729,7 +809,188 @@
           </w:tcPr>
           <w:p>
             <w:r>
-              <w:t>Scored sessions (excl. UNPROCESSED/null)</w:t>
+              <w:t>FALSE NEGATIVE — AstroTalk clean, we flagged</w:t>
+            </w:r>
+          </w:p>
+        </w:tc>
+        <w:tc>
+          <w:tcPr>
+            <w:tcW w:type="dxa" w:w="4320"/>
+          </w:tcPr>
+          <w:p>
+            <w:r>
+              <w:t>1</w:t>
+            </w:r>
+          </w:p>
+        </w:tc>
+      </w:tr>
+      <w:tr>
+        <w:tc>
+          <w:tcPr>
+            <w:tcW w:type="dxa" w:w="4320"/>
+          </w:tcPr>
+          <w:p>
+            <w:r>
+              <w:t xml:space="preserve">    by Manual flag (source=MANUAL)</w:t>
+            </w:r>
+          </w:p>
+        </w:tc>
+        <w:tc>
+          <w:tcPr>
+            <w:tcW w:type="dxa" w:w="4320"/>
+          </w:tcPr>
+          <w:p>
+            <w:r>
+              <w:t>1</w:t>
+            </w:r>
+          </w:p>
+        </w:tc>
+      </w:tr>
+      <w:tr>
+        <w:tc>
+          <w:tcPr>
+            <w:tcW w:type="dxa" w:w="4320"/>
+          </w:tcPr>
+          <w:p>
+            <w:r>
+              <w:t xml:space="preserve">    by LLM flag (source=LLM)</w:t>
+            </w:r>
+          </w:p>
+        </w:tc>
+        <w:tc>
+          <w:tcPr>
+            <w:tcW w:type="dxa" w:w="4320"/>
+          </w:tcPr>
+          <w:p>
+            <w:r>
+              <w:t>0</w:t>
+            </w:r>
+          </w:p>
+        </w:tc>
+      </w:tr>
+      <w:tr>
+        <w:tc>
+          <w:tcPr>
+            <w:tcW w:type="dxa" w:w="4320"/>
+          </w:tcPr>
+          <w:p>
+            <w:r>
+              <w:t>FALSE POSITIVE — AstroTalk flagged, verdict CLEAN</w:t>
+            </w:r>
+          </w:p>
+        </w:tc>
+        <w:tc>
+          <w:tcPr>
+            <w:tcW w:type="dxa" w:w="4320"/>
+          </w:tcPr>
+          <w:p>
+            <w:r>
+              <w:t>0</w:t>
+            </w:r>
+          </w:p>
+        </w:tc>
+      </w:tr>
+      <w:tr>
+        <w:tc>
+          <w:tcPr>
+            <w:tcW w:type="dxa" w:w="4320"/>
+          </w:tcPr>
+          <w:p>
+            <w:r>
+              <w:t xml:space="preserve">    cleared by Manual review</w:t>
+            </w:r>
+          </w:p>
+        </w:tc>
+        <w:tc>
+          <w:tcPr>
+            <w:tcW w:type="dxa" w:w="4320"/>
+          </w:tcPr>
+          <w:p>
+            <w:r>
+              <w:t>0</w:t>
+            </w:r>
+          </w:p>
+        </w:tc>
+      </w:tr>
+      <w:tr>
+        <w:tc>
+          <w:tcPr>
+            <w:tcW w:type="dxa" w:w="4320"/>
+          </w:tcPr>
+          <w:p>
+            <w:r>
+              <w:t xml:space="preserve">    cleared by LLM review (reviewer_id=LLM)</w:t>
+            </w:r>
+          </w:p>
+        </w:tc>
+        <w:tc>
+          <w:tcPr>
+            <w:tcW w:type="dxa" w:w="4320"/>
+          </w:tcPr>
+          <w:p>
+            <w:r>
+              <w:t>0</w:t>
+            </w:r>
+          </w:p>
+        </w:tc>
+      </w:tr>
+      <w:tr>
+        <w:tc>
+          <w:tcPr>
+            <w:tcW w:type="dxa" w:w="4320"/>
+          </w:tcPr>
+          <w:p>
+            <w:r>
+              <w:t>Clean by both (AstroTalk clean + verdict CLEAN)</w:t>
+            </w:r>
+          </w:p>
+        </w:tc>
+        <w:tc>
+          <w:tcPr>
+            <w:tcW w:type="dxa" w:w="4320"/>
+          </w:tcPr>
+          <w:p>
+            <w:r>
+              <w:t>2</w:t>
+            </w:r>
+          </w:p>
+        </w:tc>
+      </w:tr>
+    </w:tbl>
+    <w:p>
+      <w:r>
+        <w:rPr>
+          <w:i/>
+        </w:rPr>
+        <w:t>FN by source may overlap (a session can have both MANUAL and LLM flags). Active flags only; re-engagement excluded.</w:t>
+      </w:r>
+    </w:p>
+    <w:p>
+      <w:pPr>
+        <w:pStyle w:val="Heading1"/>
+      </w:pPr>
+      <w:r>
+        <w:t>AstroTalk accuracy (vs our review)</w:t>
+      </w:r>
+    </w:p>
+    <w:tbl>
+      <w:tblPr>
+        <w:tblStyle w:val="LightGrid-Accent1"/>
+        <w:tblW w:type="auto" w:w="0"/>
+        <w:tblLook w:firstColumn="1" w:firstRow="1" w:lastColumn="0" w:lastRow="0" w:noHBand="0" w:noVBand="1" w:val="04A0"/>
+      </w:tblPr>
+      <w:tblGrid>
+        <w:gridCol w:w="4320"/>
+        <w:gridCol w:w="4320"/>
+      </w:tblGrid>
+      <w:tr>
+        <w:tc>
+          <w:tcPr>
+            <w:tcW w:type="dxa" w:w="4320"/>
+          </w:tcPr>
+          <w:p>
+            <w:r>
+              <w:t>Scored sessions</w:t>
             </w:r>
           </w:p>
         </w:tc>
@@ -751,7 +1012,7 @@
           </w:tcPr>
           <w:p>
             <w:r>
-              <w:t>True  Positive (TP) — flagged &amp; bad</w:t>
+              <w:t>True  Positive (TP) — astro flagged &amp; we flagged</w:t>
             </w:r>
           </w:p>
         </w:tc>
@@ -773,7 +1034,7 @@
           </w:tcPr>
           <w:p>
             <w:r>
-              <w:t>False Positive (FP) — flagged &amp; CLEAN</w:t>
+              <w:t>False Positive (FP) — astro flagged &amp; verdict CLEAN</w:t>
             </w:r>
           </w:p>
         </w:tc>
@@ -795,7 +1056,7 @@
           </w:tcPr>
           <w:p>
             <w:r>
-              <w:t>False Negative (FN) — clean &amp; bad (missed)</w:t>
+              <w:t>False Negative (FN) — astro clean &amp; we flagged</w:t>
             </w:r>
           </w:p>
         </w:tc>
@@ -817,7 +1078,7 @@
           </w:tcPr>
           <w:p>
             <w:r>
-              <w:t>True  Negative (TN) — clean &amp; CLEAN</w:t>
+              <w:t>True  Negative (TN) — astro clean &amp; verdict CLEAN</w:t>
             </w:r>
           </w:p>
         </w:tc>
@@ -979,29 +1240,7 @@
           </w:tcPr>
           <w:p>
             <w:r>
-              <w:t>Sessions processed by LLM</w:t>
-            </w:r>
-          </w:p>
-        </w:tc>
-        <w:tc>
-          <w:tcPr>
-            <w:tcW w:type="dxa" w:w="4320"/>
-          </w:tcPr>
-          <w:p>
-            <w:r>
-              <w:t>4</w:t>
-            </w:r>
-          </w:p>
-        </w:tc>
-      </w:tr>
-      <w:tr>
-        <w:tc>
-          <w:tcPr>
-            <w:tcW w:type="dxa" w:w="4320"/>
-          </w:tcPr>
-          <w:p>
-            <w:r>
-              <w:t>Sessions not yet processed</w:t>
+              <w:t>LLM-ingested sessions</w:t>
             </w:r>
           </w:p>
         </w:tc>
@@ -1023,7 +1262,29 @@
           </w:tcPr>
           <w:p>
             <w:r>
-              <w:t>Sessions with LLM flags</w:t>
+              <w:t xml:space="preserve">  - with an LLM-source flag</w:t>
+            </w:r>
+          </w:p>
+        </w:tc>
+        <w:tc>
+          <w:tcPr>
+            <w:tcW w:type="dxa" w:w="4320"/>
+          </w:tcPr>
+          <w:p>
+            <w:r>
+              <w:t>0</w:t>
+            </w:r>
+          </w:p>
+        </w:tc>
+      </w:tr>
+      <w:tr>
+        <w:tc>
+          <w:tcPr>
+            <w:tcW w:type="dxa" w:w="4320"/>
+          </w:tcPr>
+          <w:p>
+            <w:r>
+              <w:t xml:space="preserve">  - clean auto-submit (reviewer_id=LLM)</w:t>
             </w:r>
           </w:p>
         </w:tc>
@@ -1687,7 +1948,7 @@
           </w:tcPr>
           <w:p>
             <w:r>
-              <w:t>2</w:t>
+              <w:t>1</w:t>
             </w:r>
           </w:p>
         </w:tc>
@@ -1772,7 +2033,7 @@
           </w:tcPr>
           <w:p>
             <w:r>
-              <w:t>4</w:t>
+              <w:t>3</w:t>
             </w:r>
           </w:p>
         </w:tc>
@@ -1813,7 +2074,7 @@
           </w:tcPr>
           <w:p>
             <w:r>
-              <w:t>4</w:t>
+              <w:t>3</w:t>
             </w:r>
           </w:p>
         </w:tc>
@@ -1854,7 +2115,7 @@
           </w:tcPr>
           <w:p>
             <w:r>
-              <w:t>4</w:t>
+              <w:t>3</w:t>
             </w:r>
           </w:p>
         </w:tc>
@@ -1983,565 +2244,7 @@
           </w:tcPr>
           <w:p>
             <w:r>
-              <w:t>4.00</w:t>
-            </w:r>
-          </w:p>
-        </w:tc>
-      </w:tr>
-    </w:tbl>
-    <w:p>
-      <w:pPr>
-        <w:pStyle w:val="Heading1"/>
-      </w:pPr>
-      <w:r>
-        <w:t>Flagged sessions by flag author (turn speaker)</w:t>
-      </w:r>
-    </w:p>
-    <w:tbl>
-      <w:tblPr>
-        <w:tblStyle w:val="LightGrid-Accent1"/>
-        <w:tblW w:type="auto" w:w="0"/>
-        <w:tblLook w:firstColumn="1" w:firstRow="1" w:lastColumn="0" w:lastRow="0" w:noHBand="0" w:noVBand="1" w:val="04A0"/>
-      </w:tblPr>
-      <w:tblGrid>
-        <w:gridCol w:w="4320"/>
-        <w:gridCol w:w="4320"/>
-      </w:tblGrid>
-      <w:tr>
-        <w:tc>
-          <w:tcPr>
-            <w:tcW w:type="dxa" w:w="4320"/>
-          </w:tcPr>
-          <w:p>
-            <w:r>
-              <w:t>Flagged sessions (have &gt;=1 flag)</w:t>
-            </w:r>
-          </w:p>
-        </w:tc>
-        <w:tc>
-          <w:tcPr>
-            <w:tcW w:type="dxa" w:w="4320"/>
-          </w:tcPr>
-          <w:p>
-            <w:r>
-              <w:t>1</w:t>
-            </w:r>
-          </w:p>
-        </w:tc>
-      </w:tr>
-      <w:tr>
-        <w:tc>
-          <w:tcPr>
-            <w:tcW w:type="dxa" w:w="4320"/>
-          </w:tcPr>
-          <w:p>
-            <w:r>
-              <w:t>- with an ASTROLOGER-turn flag</w:t>
-            </w:r>
-          </w:p>
-        </w:tc>
-        <w:tc>
-          <w:tcPr>
-            <w:tcW w:type="dxa" w:w="4320"/>
-          </w:tcPr>
-          <w:p>
-            <w:r>
-              <w:t>1</w:t>
-            </w:r>
-          </w:p>
-        </w:tc>
-      </w:tr>
-      <w:tr>
-        <w:tc>
-          <w:tcPr>
-            <w:tcW w:type="dxa" w:w="4320"/>
-          </w:tcPr>
-          <w:p>
-            <w:r>
-              <w:t>- with a USER-turn flag</w:t>
-            </w:r>
-          </w:p>
-        </w:tc>
-        <w:tc>
-          <w:tcPr>
-            <w:tcW w:type="dxa" w:w="4320"/>
-          </w:tcPr>
-          <w:p>
-            <w:r>
-              <w:t>1</w:t>
-            </w:r>
-          </w:p>
-        </w:tc>
-      </w:tr>
-      <w:tr>
-        <w:tc>
-          <w:tcPr>
-            <w:tcW w:type="dxa" w:w="4320"/>
-          </w:tcPr>
-          <w:p>
-            <w:r>
-              <w:t>- mixed (both speakers flagged)</w:t>
-            </w:r>
-          </w:p>
-        </w:tc>
-        <w:tc>
-          <w:tcPr>
-            <w:tcW w:type="dxa" w:w="4320"/>
-          </w:tcPr>
-          <w:p>
-            <w:r>
-              <w:t>1</w:t>
-            </w:r>
-          </w:p>
-        </w:tc>
-      </w:tr>
-      <w:tr>
-        <w:tc>
-          <w:tcPr>
-            <w:tcW w:type="dxa" w:w="4320"/>
-          </w:tcPr>
-          <w:p>
-            <w:r>
-              <w:t>- ONLY astrologer-turn flags</w:t>
-            </w:r>
-          </w:p>
-        </w:tc>
-        <w:tc>
-          <w:tcPr>
-            <w:tcW w:type="dxa" w:w="4320"/>
-          </w:tcPr>
-          <w:p>
-            <w:r>
-              <w:t>0</w:t>
-            </w:r>
-          </w:p>
-        </w:tc>
-      </w:tr>
-      <w:tr>
-        <w:tc>
-          <w:tcPr>
-            <w:tcW w:type="dxa" w:w="4320"/>
-          </w:tcPr>
-          <w:p>
-            <w:r>
-              <w:t>- ONLY user-turn flags</w:t>
-            </w:r>
-          </w:p>
-        </w:tc>
-        <w:tc>
-          <w:tcPr>
-            <w:tcW w:type="dxa" w:w="4320"/>
-          </w:tcPr>
-          <w:p>
-            <w:r>
-              <w:t>0</w:t>
-            </w:r>
-          </w:p>
-        </w:tc>
-      </w:tr>
-    </w:tbl>
-    <w:p>
-      <w:pPr>
-        <w:pStyle w:val="Heading1"/>
-      </w:pPr>
-      <w:r>
-        <w:t>Language (volume + flag rate)</w:t>
-      </w:r>
-    </w:p>
-    <w:tbl>
-      <w:tblPr>
-        <w:tblStyle w:val="LightGrid-Accent1"/>
-        <w:tblW w:type="auto" w:w="0"/>
-        <w:tblLook w:firstColumn="1" w:firstRow="1" w:lastColumn="0" w:lastRow="0" w:noHBand="0" w:noVBand="1" w:val="04A0"/>
-      </w:tblPr>
-      <w:tblGrid>
-        <w:gridCol w:w="2160"/>
-        <w:gridCol w:w="2160"/>
-        <w:gridCol w:w="2160"/>
-        <w:gridCol w:w="2160"/>
-      </w:tblGrid>
-      <w:tr>
-        <w:tc>
-          <w:tcPr>
-            <w:tcW w:type="dxa" w:w="2160"/>
-          </w:tcPr>
-          <w:p>
-            <w:r>
-              <w:rPr>
-                <w:b/>
-              </w:rPr>
-              <w:t>LANGUAGE</w:t>
-            </w:r>
-          </w:p>
-        </w:tc>
-        <w:tc>
-          <w:tcPr>
-            <w:tcW w:type="dxa" w:w="2160"/>
-          </w:tcPr>
-          <w:p>
-            <w:r>
-              <w:rPr>
-                <w:b/>
-              </w:rPr>
-              <w:t>TOTAL</w:t>
-            </w:r>
-          </w:p>
-        </w:tc>
-        <w:tc>
-          <w:tcPr>
-            <w:tcW w:type="dxa" w:w="2160"/>
-          </w:tcPr>
-          <w:p>
-            <w:r>
-              <w:rPr>
-                <w:b/>
-              </w:rPr>
-              <w:t>FLAGGED</w:t>
-            </w:r>
-          </w:p>
-        </w:tc>
-        <w:tc>
-          <w:tcPr>
-            <w:tcW w:type="dxa" w:w="2160"/>
-          </w:tcPr>
-          <w:p>
-            <w:r>
-              <w:rPr>
-                <w:b/>
-              </w:rPr>
-              <w:t>RATE</w:t>
-            </w:r>
-          </w:p>
-        </w:tc>
-      </w:tr>
-      <w:tr>
-        <w:tc>
-          <w:tcPr>
-            <w:tcW w:type="dxa" w:w="2160"/>
-          </w:tcPr>
-          <w:p>
-            <w:r>
-              <w:t>(null)</w:t>
-            </w:r>
-          </w:p>
-        </w:tc>
-        <w:tc>
-          <w:tcPr>
-            <w:tcW w:type="dxa" w:w="2160"/>
-          </w:tcPr>
-          <w:p>
-            <w:r>
-              <w:t>4</w:t>
-            </w:r>
-          </w:p>
-        </w:tc>
-        <w:tc>
-          <w:tcPr>
-            <w:tcW w:type="dxa" w:w="2160"/>
-          </w:tcPr>
-          <w:p>
-            <w:r>
-              <w:t>1</w:t>
-            </w:r>
-          </w:p>
-        </w:tc>
-        <w:tc>
-          <w:tcPr>
-            <w:tcW w:type="dxa" w:w="2160"/>
-          </w:tcPr>
-          <w:p>
-            <w:r>
-              <w:t>25.0%</w:t>
-            </w:r>
-          </w:p>
-        </w:tc>
-      </w:tr>
-    </w:tbl>
-    <w:p>
-      <w:pPr>
-        <w:pStyle w:val="Heading1"/>
-      </w:pPr>
-      <w:r>
-        <w:t>Time trend (by month)</w:t>
-      </w:r>
-    </w:p>
-    <w:tbl>
-      <w:tblPr>
-        <w:tblStyle w:val="LightGrid-Accent1"/>
-        <w:tblW w:type="auto" w:w="0"/>
-        <w:tblLook w:firstColumn="1" w:firstRow="1" w:lastColumn="0" w:lastRow="0" w:noHBand="0" w:noVBand="1" w:val="04A0"/>
-      </w:tblPr>
-      <w:tblGrid>
-        <w:gridCol w:w="2160"/>
-        <w:gridCol w:w="2160"/>
-        <w:gridCol w:w="2160"/>
-        <w:gridCol w:w="2160"/>
-      </w:tblGrid>
-      <w:tr>
-        <w:tc>
-          <w:tcPr>
-            <w:tcW w:type="dxa" w:w="2160"/>
-          </w:tcPr>
-          <w:p>
-            <w:r>
-              <w:rPr>
-                <w:b/>
-              </w:rPr>
-              <w:t>MONTH</w:t>
-            </w:r>
-          </w:p>
-        </w:tc>
-        <w:tc>
-          <w:tcPr>
-            <w:tcW w:type="dxa" w:w="2160"/>
-          </w:tcPr>
-          <w:p>
-            <w:r>
-              <w:rPr>
-                <w:b/>
-              </w:rPr>
-              <w:t>TOTAL</w:t>
-            </w:r>
-          </w:p>
-        </w:tc>
-        <w:tc>
-          <w:tcPr>
-            <w:tcW w:type="dxa" w:w="2160"/>
-          </w:tcPr>
-          <w:p>
-            <w:r>
-              <w:rPr>
-                <w:b/>
-              </w:rPr>
-              <w:t>FLAGGED</w:t>
-            </w:r>
-          </w:p>
-        </w:tc>
-        <w:tc>
-          <w:tcPr>
-            <w:tcW w:type="dxa" w:w="2160"/>
-          </w:tcPr>
-          <w:p>
-            <w:r>
-              <w:rPr>
-                <w:b/>
-              </w:rPr>
-              <w:t>RATE</w:t>
-            </w:r>
-          </w:p>
-        </w:tc>
-      </w:tr>
-      <w:tr>
-        <w:tc>
-          <w:tcPr>
-            <w:tcW w:type="dxa" w:w="2160"/>
-          </w:tcPr>
-          <w:p>
-            <w:r>
-              <w:t>(null)</w:t>
-            </w:r>
-          </w:p>
-        </w:tc>
-        <w:tc>
-          <w:tcPr>
-            <w:tcW w:type="dxa" w:w="2160"/>
-          </w:tcPr>
-          <w:p>
-            <w:r>
-              <w:t>4</w:t>
-            </w:r>
-          </w:p>
-        </w:tc>
-        <w:tc>
-          <w:tcPr>
-            <w:tcW w:type="dxa" w:w="2160"/>
-          </w:tcPr>
-          <w:p>
-            <w:r>
-              <w:t>1</w:t>
-            </w:r>
-          </w:p>
-        </w:tc>
-        <w:tc>
-          <w:tcPr>
-            <w:tcW w:type="dxa" w:w="2160"/>
-          </w:tcPr>
-          <w:p>
-            <w:r>
-              <w:t>25.0%</w:t>
-            </w:r>
-          </w:p>
-        </w:tc>
-      </w:tr>
-    </w:tbl>
-    <w:p>
-      <w:pPr>
-        <w:pStyle w:val="Heading1"/>
-      </w:pPr>
-      <w:r>
-        <w:t>Anomalies / data quality</w:t>
-      </w:r>
-    </w:p>
-    <w:tbl>
-      <w:tblPr>
-        <w:tblStyle w:val="LightGrid-Accent1"/>
-        <w:tblW w:type="auto" w:w="0"/>
-        <w:tblLook w:firstColumn="1" w:firstRow="1" w:lastColumn="0" w:lastRow="0" w:noHBand="0" w:noVBand="1" w:val="04A0"/>
-      </w:tblPr>
-      <w:tblGrid>
-        <w:gridCol w:w="4320"/>
-        <w:gridCol w:w="4320"/>
-      </w:tblGrid>
-      <w:tr>
-        <w:tc>
-          <w:tcPr>
-            <w:tcW w:type="dxa" w:w="4320"/>
-          </w:tcPr>
-          <w:p>
-            <w:r>
-              <w:t>astrotalk_flagged IS NULL</w:t>
-            </w:r>
-          </w:p>
-        </w:tc>
-        <w:tc>
-          <w:tcPr>
-            <w:tcW w:type="dxa" w:w="4320"/>
-          </w:tcPr>
-          <w:p>
-            <w:r>
-              <w:t>1</w:t>
-            </w:r>
-          </w:p>
-        </w:tc>
-      </w:tr>
-      <w:tr>
-        <w:tc>
-          <w:tcPr>
-            <w:tcW w:type="dxa" w:w="4320"/>
-          </w:tcPr>
-          <w:p>
-            <w:r>
-              <w:t>verdict UNPROCESSED/null</w:t>
-            </w:r>
-          </w:p>
-        </w:tc>
-        <w:tc>
-          <w:tcPr>
-            <w:tcW w:type="dxa" w:w="4320"/>
-          </w:tcPr>
-          <w:p>
-            <w:r>
-              <w:t>0</w:t>
-            </w:r>
-          </w:p>
-        </w:tc>
-      </w:tr>
-      <w:tr>
-        <w:tc>
-          <w:tcPr>
-            <w:tcW w:type="dxa" w:w="4320"/>
-          </w:tcPr>
-          <w:p>
-            <w:r>
-              <w:t>LOCKED with locked_by null</w:t>
-            </w:r>
-          </w:p>
-        </w:tc>
-        <w:tc>
-          <w:tcPr>
-            <w:tcW w:type="dxa" w:w="4320"/>
-          </w:tcPr>
-          <w:p>
-            <w:r>
-              <w:t>1</w:t>
-            </w:r>
-          </w:p>
-        </w:tc>
-      </w:tr>
-      <w:tr>
-        <w:tc>
-          <w:tcPr>
-            <w:tcW w:type="dxa" w:w="4320"/>
-          </w:tcPr>
-          <w:p>
-            <w:r>
-              <w:t>flags with source null</w:t>
-            </w:r>
-          </w:p>
-        </w:tc>
-        <w:tc>
-          <w:tcPr>
-            <w:tcW w:type="dxa" w:w="4320"/>
-          </w:tcPr>
-          <w:p>
-            <w:r>
-              <w:t>0</w:t>
-            </w:r>
-          </w:p>
-        </w:tc>
-      </w:tr>
-      <w:tr>
-        <w:tc>
-          <w:tcPr>
-            <w:tcW w:type="dxa" w:w="4320"/>
-          </w:tcPr>
-          <w:p>
-            <w:r>
-              <w:t>flags with status null</w:t>
-            </w:r>
-          </w:p>
-        </w:tc>
-        <w:tc>
-          <w:tcPr>
-            <w:tcW w:type="dxa" w:w="4320"/>
-          </w:tcPr>
-          <w:p>
-            <w:r>
-              <w:t>0</w:t>
-            </w:r>
-          </w:p>
-        </w:tc>
-      </w:tr>
-      <w:tr>
-        <w:tc>
-          <w:tcPr>
-            <w:tcW w:type="dxa" w:w="4320"/>
-          </w:tcPr>
-          <w:p>
-            <w:r>
-              <w:t>flags category_code lowercase</w:t>
-            </w:r>
-          </w:p>
-        </w:tc>
-        <w:tc>
-          <w:tcPr>
-            <w:tcW w:type="dxa" w:w="4320"/>
-          </w:tcPr>
-          <w:p>
-            <w:r>
-              <w:t>0</w:t>
-            </w:r>
-          </w:p>
-        </w:tc>
-      </w:tr>
-      <w:tr>
-        <w:tc>
-          <w:tcPr>
-            <w:tcW w:type="dxa" w:w="4320"/>
-          </w:tcPr>
-          <w:p>
-            <w:r>
-              <w:t>sessions verdict lowercase</w:t>
-            </w:r>
-          </w:p>
-        </w:tc>
-        <w:tc>
-          <w:tcPr>
-            <w:tcW w:type="dxa" w:w="4320"/>
-          </w:tcPr>
-          <w:p>
-            <w:r>
-              <w:t>0</w:t>
+              <w:t>3.00</w:t>
             </w:r>
           </w:p>
         </w:tc>

</xml_diff>